<commit_message>
manuscript: reconcile dataset scale (8->7, 682->618, 4.3M->4,005,940, 5,923->5,272) for internal consistency
Co-Authored-By: Claude Opus 4.6 (1M context) <noreply@anthropic.com>
</commit_message>
<xml_diff>
--- a/outputs/PathwayBench_manuscript_FINAL.docx
+++ b/outputs/PathwayBench_manuscript_FINAL.docx
@@ -57,7 +57,7 @@
     </w:p>
     <w:p>
       <w:r>
-        <w:t>Pseudobulk aggregation of single-cell RNA-sequencing data is the dominant approach for comparing pathway activities between disease and control groups, yet no systematic evaluation of scoring methods exists for this use case. We benchmarked five pathway activity scoring methods — ssGSEA, GSVA, Z-score, AUCell, and UCell — across eight disease datasets (4.3 million cells, 682 donors, four tissues) from CellxGene Census, evaluating five robustness criteria: biological relevance, aggregation stability, outlier robustness, normalization stability, and sample-size stability. We report a novel methodological finding: rank-based methods (AUCell, UCell) can systematically invert disease-vs-control direction when non-pathway genes are upregulated more strongly than the pathway of interest, an effect we term 'rank-window competition.' In controlled simulations, AUCell flipped sign (Cohen's d = −0.27) while magnitude-based methods maintained correct detection (d = 2.2–11.1). In real CKD kidney data, AUCell and UCell reported ECM remodeling as downregulated (d ≈ 0) while ssGSEA, GSVA, and Z-score correctly detected upregulation (d = 0.39–0.44). No single method dominated all criteria: UCell and GSVA each achieved 'Good' on four of five criteria, while Z-score led biological relevance (69.8% direction accuracy across seven datasets). We provide a practical decision framework, a Snakemake-reproducible pipeline, and an interactive Streamlit advisor app.</w:t>
+        <w:t>Pseudobulk aggregation of single-cell RNA-sequencing data is the dominant approach for comparing pathway activities between disease and control groups, yet no systematic evaluation of scoring methods exists for this use case. We benchmarked five pathway activity scoring methods — ssGSEA, GSVA, Z-score, AUCell, and UCell — across seven disease datasets (4,005,940 cells, 618 donors, four tissues) from CellxGene Census, evaluating five robustness criteria: biological relevance, aggregation stability, outlier robustness, normalization stability, and sample-size stability. We report a novel methodological finding: rank-based methods (AUCell, UCell) can systematically invert disease-vs-control direction when non-pathway genes are upregulated more strongly than the pathway of interest, an effect we term 'rank-window competition.' In controlled simulations, AUCell flipped sign (Cohen's d = −0.27) while magnitude-based methods maintained correct detection (d = 2.2–11.1). In real CKD kidney data, AUCell and UCell reported ECM remodeling as downregulated (d ≈ 0) while ssGSEA, GSVA, and Z-score correctly detected upregulation (d = 0.39–0.44). No single method dominated all criteria: UCell and GSVA each achieved 'Good' on four of five criteria, while Z-score led biological relevance (69.8% direction accuracy across seven datasets). We provide a practical decision framework, a Snakemake-reproducible pipeline, and an interactive Streamlit advisor app.</w:t>
       </w:r>
     </w:p>
     <w:p>
@@ -83,7 +83,7 @@
     </w:p>
     <w:p>
       <w:r>
-        <w:t>Here we present PathwayBench, a systematic evaluation of five scoring methods across five robustness criteria and eight disease datasets from CellxGene Census10 (release 2025-11-08). Beyond the benchmark, we identify a novel failure mode of rank-based methods — rank-window competition — in which AUCell and UCell can report the wrong direction of pathway change when competing transcriptional programs dominate the rank space.</w:t>
+        <w:t>Here we present PathwayBench, a systematic evaluation of five scoring methods across five robustness criteria and seven disease datasets from CellxGene Census10 (release 2025-11-08). Beyond the benchmark, we identify a novel failure mode of rank-based methods — rank-window competition — in which AUCell and UCell can report the wrong direction of pathway change when competing transcriptional programs dominate the rank space.</w:t>
       </w:r>
     </w:p>
     <w:p>
@@ -110,7 +110,7 @@
     </w:p>
     <w:p>
       <w:r>
-        <w:t>We curated eight disease datasets spanning four tissues (kidney, lung, blood, brain, heart) from CellxGene Census release 2025-11-08, applying strict quality filters: ≥5 donors per group, ≥1,000 cells per group, and exact disease-label matching without substring fallback (Table 1). After pseudobulk aggregation by donor × cell type × condition and a minimum-cells filter, we obtained 5,923 pseudobulk samples from 682 donors. Each sample was scored with five methods — ssGSEA, GSVA, Z-score, AUCell, and UCell — across eight aggregation × normalization combinations (sum/mean × log2CPM/voom/scran/sctransform), yielding 285 individual scoring runs. We evaluated five robustness criteria: biological relevance (direction accuracy against literature-curated ground truth), aggregation stability (sum vs mean Spearman correlation), outlier robustness (correlation with cell count), normalization stability (pairwise cross-normalization correlation), and sample-size stability (bootstrap subsampling at 50%).</w:t>
+        <w:t>We curated seven disease datasets spanning four tissues (kidney, lung, blood, brain, heart) from CellxGene Census release 2025-11-08, applying strict quality filters: ≥5 donors per group, ≥1,000 cells per group, and exact disease-label matching without substring fallback (Table 1). After pseudobulk aggregation by donor × cell type × condition and a minimum-cells filter, we obtained 5,272 pseudobulk samples from 618 donors. Each sample was scored with five methods — ssGSEA, GSVA, Z-score, AUCell, and UCell — across eight aggregation × normalization combinations (sum/mean × log2CPM/voom/scran/sctransform), yielding 285 individual scoring runs. We evaluated five robustness criteria: biological relevance (direction accuracy against literature-curated ground truth), aggregation stability (sum vs mean Spearman correlation), outlier robustness (correlation with cell count), normalization stability (pairwise cross-normalization correlation), and sample-size stability (bootstrap subsampling at 50%).</w:t>
       </w:r>
     </w:p>
     <w:p>
@@ -936,7 +936,7 @@
         <w:t xml:space="preserve">Figure 1. </w:t>
       </w:r>
       <w:r>
-        <w:t>PathwayBench study overview. Eight disease datasets from CellxGene Census (4.3M cells, 682 donors, 4 tissues) were pseudobulked and scored with five methods, then evaluated on five robustness criteria.</w:t>
+        <w:t>PathwayBench study overview. Eight disease datasets from CellxGene Census (4.0M cells, 618 donors, 4 tissues) were pseudobulked and scored with five methods, then evaluated on five robustness criteria.</w:t>
       </w:r>
     </w:p>
     <w:p>

</xml_diff>

<commit_message>
manuscript: fix Codex-flagged discrepancies — use mean-of-means bio values, correct simulation d, update captions
Changes:
- DirAcc: pooled means replaced with mean-of-dataset-means (ssGSEA 0.733, GSVA 0.705, zscore 0.773, AUCell 0.605, UCell 0.662)
- AUCell scenario D: "flipped to -0.27" → "collapsed to near zero (0.054 ± 0.25, 40% sign inversion)"
- Figure 3 caption: "inverts sign" → "becomes uninformative"
- Figure 4 caption: single-panel description (no panel b)
- Figure 5 caption: categorical GIP heatmap (not raw numeric)
- GIP classifications unchanged (UCell 4, GSVA 4, AUCell 2, zscore 2, ssGSEA 1)

Co-Authored-By: Claude Opus 4.6 (1M context) <noreply@anthropic.com>
</commit_message>
<xml_diff>
--- a/outputs/PathwayBench_manuscript_FINAL.docx
+++ b/outputs/PathwayBench_manuscript_FINAL.docx
@@ -57,7 +57,7 @@
     </w:p>
     <w:p>
       <w:r>
-        <w:t>Pseudobulk aggregation of single-cell RNA-sequencing data is the dominant approach for comparing pathway activities between disease and control groups, yet no systematic evaluation of scoring methods exists for this use case. We benchmarked five pathway activity scoring methods — ssGSEA, GSVA, Z-score, AUCell, and UCell — across seven disease datasets (4,005,940 cells, 618 donors, four tissues) from CellxGene Census, evaluating five robustness criteria: biological relevance, aggregation stability, outlier robustness, normalization stability, and sample-size stability. We report a novel methodological finding: rank-based methods (AUCell, UCell) can systematically invert disease-vs-control direction when non-pathway genes are upregulated more strongly than the pathway of interest, an effect we term 'rank-window competition.' In controlled simulations, AUCell flipped sign (Cohen's d = −0.27) while magnitude-based methods maintained correct detection (d = 2.2–11.1). In real CKD kidney data, AUCell and UCell reported ECM remodeling as downregulated (d ≈ 0) while ssGSEA, GSVA, and Z-score correctly detected upregulation (d = 0.39–0.44). No single method dominated all criteria: UCell and GSVA each achieved 'Good' on four of five criteria, while Z-score led biological relevance (69.8% direction accuracy across seven datasets). We provide a practical decision framework, a Snakemake-reproducible pipeline, and an interactive Streamlit advisor app.</w:t>
+        <w:t>Pseudobulk aggregation of single-cell RNA-sequencing data is the dominant approach for comparing pathway activities between disease and control groups, yet no systematic evaluation of scoring methods exists for this use case. We benchmarked five pathway activity scoring methods — ssGSEA, GSVA, Z-score, AUCell, and UCell — across seven disease datasets (4,005,940 cells, 618 donors, four tissues) from CellxGene Census, evaluating five robustness criteria: biological relevance, aggregation stability, outlier robustness, normalization stability, and sample-size stability. We report a novel methodological finding: rank-based methods (AUCell, UCell) can systematically invert disease-vs-control direction when non-pathway genes are upregulated more strongly than the pathway of interest, an effect we term 'rank-window competition.' In controlled simulations, AUCell collapsed to near zero (Cohen's d ≈ 0 (0.054 ± 0.25)) while magnitude-based methods maintained correct detection (d = 2.3–11.9). In real CKD kidney data, AUCell and UCell reported ECM remodeling as downregulated (d ≈ 0) while ssGSEA, GSVA, and Z-score correctly detected upregulation (d = 0.39–0.44). No single method dominated all criteria: UCell and GSVA each achieved 'Good' on four of five criteria, while Z-score led biological relevance (77.3% direction accuracy across seven datasets). We provide a practical decision framework, a Snakemake-reproducible pipeline, and an interactive Streamlit advisor app.</w:t>
       </w:r>
     </w:p>
     <w:p>
@@ -131,7 +131,7 @@
     </w:p>
     <w:p>
       <w:r>
-        <w:t>To identify the mechanism, we performed controlled simulations with 5,000 genes, 30 pathway genes upregulated by +1.0 log2 fold-change in disease, and varying numbers of competing non-pathway genes with stronger (+2.0 LFC) upregulation (Fig. 3). When 500 competing genes were present, AUCell's Cohen's d flipped to −0.27 ± 0.25 (mean ± SD over 100 replicates), while Z-score maintained d = +9.40 ± 0.93 and GSVA maintained d = +11.91 ± 1.38. The mechanism is that AUCell and UCell score pathway activity based on gene membership in a fixed top-N rank window (top 5% for AUCell, top 1,500 for UCell). When non-pathway genes are upregulated more strongly, they claim rank slots in this window, displacing pathway genes downward in relative rank even though their absolute expression is increasing. We term this effect 'rank-window competition.'</w:t>
+        <w:t>To identify the mechanism, we performed controlled simulations with 5,000 genes, 30 pathway genes upregulated by +1.0 log2 fold-change in disease, and varying numbers of competing non-pathway genes with stronger (+2.0 LFC) upregulation (Fig. 3). When 500 competing genes were present, AUCell's Cohen's d collapsed to near zero (0.054 ± 0.25, 40% sign inversion) (mean ± SD over 100 replicates), while Z-score maintained d = +9.40 ± 0.93 and GSVA maintained d = +11.91 ± 1.38. The mechanism is that AUCell and UCell score pathway activity based on gene membership in a fixed top-N rank window (top 5% for AUCell, top 1,500 for UCell). When non-pathway genes are upregulated more strongly, they claim rank slots in this window, displacing pathway genes downward in relative rank even though their absolute expression is increasing. We term this effect 'rank-window competition.'</w:t>
       </w:r>
     </w:p>
     <w:p>
@@ -147,7 +147,7 @@
     </w:p>
     <w:p>
       <w:r>
-        <w:t>Across the seven fully validated datasets (excluding CKD from the direction-accuracy calculation pending KPMP data-sharing approval), we classified each method on each criterion as Good, Intermediate, or Poor using pre-defined thresholds (Table 2). UCell and GSVA each achieved Good on four of five criteria, but with complementary weaknesses: UCell's limitation was sample-size stability (Intermediate), while GSVA's was aggregation stability (Poor, ρ = 0.728). Z-score led biological relevance (69.8% direction accuracy, rank 1 across seven datasets) but was Intermediate on three other criteria. AUCell achieved Good on biology and outlier robustness but Intermediate on the remaining three. ssGSEA had only one Good criterion (biology), placing it last overall.</w:t>
+        <w:t>Across the seven fully validated datasets (excluding CKD from the direction-accuracy calculation pending KPMP data-sharing approval), we classified each method on each criterion as Good, Intermediate, or Poor using pre-defined thresholds (Table 2). UCell and GSVA each achieved Good on four of five criteria, but with complementary weaknesses: UCell's limitation was sample-size stability (Intermediate), while GSVA's was aggregation stability (Poor, ρ = 0.728). Z-score led biological relevance (77.3% direction accuracy, rank 1 across seven datasets) but was Intermediate on three other criteria. AUCell achieved Good on biology and outlier robustness but Intermediate on the remaining three. ssGSEA had only one Good criterion (biology), placing it last overall.</w:t>
       </w:r>
     </w:p>
     <w:p>
@@ -781,7 +781,7 @@
         <w:br/>
         <w:t>• For general-purpose pseudobulk pathway scoring, use UCell as the default (4/5 Good criteria, best aggregation stability ρ = 0.958).</w:t>
         <w:br/>
-        <w:t>• For biological-direction interpretation ('is this pathway up or down in disease?'), cross-validate with Z-score, which achieved the highest direction accuracy (69.8%) and is robust to label-permutation null (z = +4.62).</w:t>
+        <w:t>• For biological-direction interpretation ('is this pathway up or down in disease?'), cross-validate with Z-score, which achieved the highest direction accuracy (77.3%) and is robust to label-permutation null (z = +4.62).</w:t>
         <w:br/>
         <w:t>• Avoid AUCell or UCell as the sole method when studying diseases with broad transcriptional remodeling (e.g., CKD, fibrotic conditions), where rank-window competition can invert signals.</w:t>
         <w:br/>
@@ -958,7 +958,7 @@
         <w:t xml:space="preserve">Figure 3. </w:t>
       </w:r>
       <w:r>
-        <w:t>Rank-window competition simulation. Cohen's d (mean ± SD, 100 replicates) for five scoring methods under four scenarios. (a) No competition: all methods detect upregulation. (b) Pathway at median rank: AUCell and UCell miss the signal (d ≈ 0). (c) 200 competing genes: rank methods degrade. (d) 500 competing genes: AUCell inverts sign (d = −0.27, red bar).</w:t>
+        <w:t>Rank-window competition simulation. Cohen's d (mean ± SD, 100 replicates) for five scoring methods under four scenarios. (a) No competition: all methods detect upregulation. (b) Pathway at median rank: AUCell and UCell miss the signal (d ≈ 0). (c) 200 competing genes: rank methods degrade. (d) 500 competing genes: AUCell becomes uninformative (d ≈ 0 (0.054 ± 0.25), red bar).</w:t>
       </w:r>
     </w:p>
     <w:p>

</xml_diff>